<commit_message>
Docs: GDD encurtado - seções novas reescritas em tom factual
- Galeria de imagens v0.5 vs v1.0 mantida (5 tabelas: J3, Maya, Elias,
  Unit-7, Elena), confirmada presente apos verificar no md.
- Seção 4.b Audio: reescrita compacta. Mantida tabela dos 10 sfx
  + 3 paragrafos curtos (musica, sfx, normalizacao). Removido bloco
  de licenca/limitacao/tres-rotas que era prolixo.
- Seção 9 Ciclo de Playtest (v1.1.0): reescrita como lista de 4
  bugs com 1 paragrafo cada (era 8 paragrafos detalhados).
- Seção 9 Segunda passada (v1.1.1): reescrita como lista de 5
  bullets curtos (era 6 paragrafos com detalhe tecnico).
- Seção 5.e Temas Sociais: 3 temas agora em uma tabela unica
  (era 3 subsecoes longas). Mantido detalhe critico: cena, fala,
  personagens, decisao, ramificacao.

Net: 146 linhas removidas, 35 adicionadas (-111 linhas). Docx
regerado: 1.37MB.
</commit_message>
<xml_diff>
--- a/Documentação/GDD - J3 Projeto.docx
+++ b/Documentação/GDD - J3 Projeto.docx
@@ -3029,312 +3029,66 @@
         <w:pStyle w:val="Heading3"/>
       </w:pPr>
       <w:r>
-        <w:t>Notas sobre a Produção do Áudio (v1.1.0)</w:t>
-      </w:r>
-    </w:p>
-    <w:p>
-      <w:r>
-        <w:t>A trilha sonora seguiu o mesmo dilema da arte: produzir 7 faixas distintas (uma por dia) à mão dentro do prazo de desenvolvedor solo não cabia. A música é parte central da atmosfera cyberpunk do J3 — silêncio não era opção. A solução foi gerar a trilha com IA musical (Suno) usando prompts dirigidos por dia (atmosfera, BPM, instrumentação, tensão narrativa pretendida) e fazer curadoria/edição manual antes de entrar no jogo.</w:t>
-      </w:r>
-    </w:p>
-    <w:p>
-      <w:r>
-        <w:t>Posição que assumi (mesma do uso de IA na arte):</w:t>
-        <w:br/>
-        <w:t>- transparência total no GDD;</w:t>
-        <w:br/>
-        <w:t>- prompts detalhados funcionando como briefing para um compositor terceirizado;</w:t>
-        <w:br/>
-        <w:t>- direção artística (escolha de atmosfera por dia, momento de corte, decisão de silenciar nos finais críticos) continua sendo minha;</w:t>
-        <w:br/>
-        <w:t>- zero uso comercial — o projeto é não-comercial, com intuito de aprendizagem.</w:t>
-      </w:r>
-    </w:p>
-    <w:p>
-      <w:r>
-        <w:rPr>
-          <w:b/>
-        </w:rPr>
-        <w:t>Faixas no build atual (5):</w:t>
-      </w:r>
-      <w:r>
-        <w:br/>
-        <w:t xml:space="preserve">- </w:t>
+        <w:t>Notas sobre a Produção do Áudio</w:t>
+      </w:r>
+    </w:p>
+    <w:p>
+      <w:r>
+        <w:t>Mesma lógica da arte: produzir 7 faixas e 10 efeitos sonoros à mão dentro do prazo solo não cabia. Solução em duas frentes:</w:t>
+      </w:r>
+    </w:p>
+    <w:p>
+      <w:pPr>
+        <w:ind w:left="360"/>
+      </w:pPr>
+      <w:r>
+        <w:t xml:space="preserve">•  </w:t>
+      </w:r>
+      <w:r>
+        <w:rPr>
+          <w:b/>
+        </w:rPr>
+        <w:t>Música (5 faixas):</w:t>
+      </w:r>
+      <w:r>
+        <w:t xml:space="preserve"> geradas via Suno com prompts dirigidos por dia (atmosfera, BPM, instrumentação) e pós-processadas no Audacity (corte, normalização, fade). Ficam em </w:t>
       </w:r>
       <w:r>
         <w:rPr>
           <w:rFonts w:ascii="Consolas" w:hAnsi="Consolas"/>
           <w:sz w:val="20"/>
         </w:rPr>
-        <w:t>After_the_Rainfall.mp3</w:t>
-      </w:r>
-      <w:r>
-        <w:t xml:space="preserve"> — pós-conflito, melancolia urbana (Dia 1, Dia 4)</w:t>
-        <w:br/>
-        <w:t xml:space="preserve">- </w:t>
+        <w:t>audio/music/</w:t>
+      </w:r>
+      <w:r>
+        <w:t xml:space="preserve">. Sistema de aleatorização em </w:t>
       </w:r>
       <w:r>
         <w:rPr>
           <w:rFonts w:ascii="Consolas" w:hAnsi="Consolas"/>
           <w:sz w:val="20"/>
         </w:rPr>
-        <w:t>Asphalt_Downpour.mp3</w:t>
-      </w:r>
-      <w:r>
-        <w:t xml:space="preserve"> — chuva neon, abertura cyberpunk (Dia 1)</w:t>
-        <w:br/>
-        <w:t xml:space="preserve">- </w:t>
-      </w:r>
-      <w:r>
-        <w:rPr>
-          <w:rFonts w:ascii="Consolas" w:hAnsi="Consolas"/>
-          <w:sz w:val="20"/>
-        </w:rPr>
-        <w:t>Late_Shift_at_Terminal_.mp3</w:t>
-      </w:r>
-      <w:r>
-        <w:t xml:space="preserve"> — tensão noturna, espaço público (Dia 2, Dia 3)</w:t>
-        <w:br/>
-        <w:t xml:space="preserve">- </w:t>
-      </w:r>
-      <w:r>
-        <w:rPr>
-          <w:rFonts w:ascii="Consolas" w:hAnsi="Consolas"/>
-          <w:sz w:val="20"/>
-        </w:rPr>
-        <w:t>Piston_Alignment.mp3</w:t>
-      </w:r>
-      <w:r>
-        <w:t xml:space="preserve"> — industrial mecânico (Dia 3, Dia 5)</w:t>
-        <w:br/>
-        <w:t xml:space="preserve">- </w:t>
-      </w:r>
-      <w:r>
-        <w:rPr>
-          <w:rFonts w:ascii="Consolas" w:hAnsi="Consolas"/>
-          <w:sz w:val="20"/>
-        </w:rPr>
-        <w:t>Sub_Level_View.mp3</w:t>
-      </w:r>
-      <w:r>
-        <w:t xml:space="preserve"> — ambient subterrâneo (Dia 4, Dia 6)</w:t>
-      </w:r>
-    </w:p>
-    <w:p>
-      <w:r>
-        <w:rPr>
-          <w:b/>
-        </w:rPr>
-        <w:t>Sistema de aleatorização (musica.rpy):</w:t>
-      </w:r>
-      <w:r>
-        <w:t xml:space="preserve"> o canal </w:t>
-      </w:r>
-      <w:r>
-        <w:rPr>
-          <w:rFonts w:ascii="Consolas" w:hAnsi="Consolas"/>
-          <w:sz w:val="20"/>
-        </w:rPr>
-        <w:t>music</w:t>
-      </w:r>
-      <w:r>
-        <w:t xml:space="preserve"> toca uma faixa aleatória, e quando ela termina o callback </w:t>
-      </w:r>
-      <w:r>
-        <w:rPr>
-          <w:rFonts w:ascii="Consolas" w:hAnsi="Consolas"/>
-          <w:sz w:val="20"/>
-        </w:rPr>
-        <w:t>_music_queue_next</w:t>
-      </w:r>
-      <w:r>
-        <w:t xml:space="preserve"> enfileira outra sem repetir a anterior. Persiste através de saves (Ren'Py salva o estado do canal). Nos finais críticos (0A desligamento, 0B colapso, 0C captura) a flag </w:t>
-      </w:r>
-      <w:r>
-        <w:rPr>
-          <w:rFonts w:ascii="Consolas" w:hAnsi="Consolas"/>
-          <w:sz w:val="20"/>
-        </w:rPr>
-        <w:t>_music_random_enabled</w:t>
-      </w:r>
-      <w:r>
-        <w:t xml:space="preserve"> é setada como </w:t>
-      </w:r>
-      <w:r>
-        <w:rPr>
-          <w:rFonts w:ascii="Consolas" w:hAnsi="Consolas"/>
-          <w:sz w:val="20"/>
-        </w:rPr>
-        <w:t>False</w:t>
-      </w:r>
-      <w:r>
-        <w:t xml:space="preserve"> antes do </w:t>
-      </w:r>
-      <w:r>
-        <w:rPr>
-          <w:rFonts w:ascii="Consolas" w:hAnsi="Consolas"/>
-          <w:sz w:val="20"/>
-        </w:rPr>
-        <w:t>stop music</w:t>
-      </w:r>
-      <w:r>
-        <w:t xml:space="preserve"> para impedir que o callback re-enfileire — silêncio absoluto é parte da carga emocional desses finais.</w:t>
-      </w:r>
-    </w:p>
-    <w:p>
-      <w:r>
-        <w:rPr>
-          <w:b/>
-        </w:rPr>
-        <w:t>Pós-processamento manual:</w:t>
-      </w:r>
-      <w:r>
-        <w:t xml:space="preserve"> cada faixa gerada pela Suno passou por edição no Audacity — corte de seções fracas, normalização de loudness para evitar variação brusca entre faixas, fade-in/fade-out para encaixar no callback de fila. A IA gera a base; a finalização garante que duas faixas seguidas não soem como playlist aleatória, mas como continuidade de trilha.</w:t>
-      </w:r>
-    </w:p>
-    <w:p>
-      <w:r>
-        <w:rPr>
-          <w:b/>
-        </w:rPr>
-        <w:t>Efeitos sonoros (sfx) — gerados localmente em Python:</w:t>
-      </w:r>
-    </w:p>
-    <w:p>
-      <w:r>
-        <w:t xml:space="preserve">A primeira versão do jogo tinha vários momentos com som no roteiro (gritos de multidão, alarme, sirene, explosão, etc.) que ficavam mudos porque os arquivos </w:t>
-      </w:r>
-      <w:r>
-        <w:rPr>
-          <w:rFonts w:ascii="Consolas" w:hAnsi="Consolas"/>
-          <w:sz w:val="20"/>
-        </w:rPr>
-        <w:t>.wav</w:t>
-      </w:r>
-      <w:r>
-        <w:t xml:space="preserve"> não existiam. Os 10 sons necessários eram: </w:t>
-      </w:r>
-      <w:r>
-        <w:rPr>
-          <w:rFonts w:ascii="Consolas" w:hAnsi="Consolas"/>
-          <w:sz w:val="20"/>
-        </w:rPr>
-        <w:t>crowd_noise</w:t>
-      </w:r>
-      <w:r>
-        <w:t xml:space="preserve">, </w:t>
-      </w:r>
-      <w:r>
-        <w:rPr>
-          <w:rFonts w:ascii="Consolas" w:hAnsi="Consolas"/>
-          <w:sz w:val="20"/>
-        </w:rPr>
-        <w:t>alert</w:t>
-      </w:r>
-      <w:r>
-        <w:t xml:space="preserve">, </w:t>
-      </w:r>
-      <w:r>
-        <w:rPr>
-          <w:rFonts w:ascii="Consolas" w:hAnsi="Consolas"/>
-          <w:sz w:val="20"/>
-        </w:rPr>
-        <w:t>alarm</w:t>
-      </w:r>
-      <w:r>
-        <w:t xml:space="preserve">, </w:t>
-      </w:r>
-      <w:r>
-        <w:rPr>
-          <w:rFonts w:ascii="Consolas" w:hAnsi="Consolas"/>
-          <w:sz w:val="20"/>
-        </w:rPr>
-        <w:t>sirens</w:t>
-      </w:r>
-      <w:r>
-        <w:t xml:space="preserve">, </w:t>
-      </w:r>
-      <w:r>
-        <w:rPr>
-          <w:rFonts w:ascii="Consolas" w:hAnsi="Consolas"/>
-          <w:sz w:val="20"/>
-        </w:rPr>
-        <w:t>sirens_close</w:t>
-      </w:r>
-      <w:r>
-        <w:t xml:space="preserve">, </w:t>
-      </w:r>
-      <w:r>
-        <w:rPr>
-          <w:rFonts w:ascii="Consolas" w:hAnsi="Consolas"/>
-          <w:sz w:val="20"/>
-        </w:rPr>
-        <w:t>news_broadcast</w:t>
-      </w:r>
-      <w:r>
-        <w:t xml:space="preserve">, </w:t>
-      </w:r>
-      <w:r>
-        <w:rPr>
-          <w:rFonts w:ascii="Consolas" w:hAnsi="Consolas"/>
-          <w:sz w:val="20"/>
-        </w:rPr>
-        <w:t>explosions</w:t>
-      </w:r>
-      <w:r>
-        <w:t xml:space="preserve">, </w:t>
-      </w:r>
-      <w:r>
-        <w:rPr>
-          <w:rFonts w:ascii="Consolas" w:hAnsi="Consolas"/>
-          <w:sz w:val="20"/>
-        </w:rPr>
-        <w:t>emp_blasts</w:t>
-      </w:r>
-      <w:r>
-        <w:t xml:space="preserve">, </w:t>
-      </w:r>
-      <w:r>
-        <w:rPr>
-          <w:rFonts w:ascii="Consolas" w:hAnsi="Consolas"/>
-          <w:sz w:val="20"/>
-        </w:rPr>
-        <w:t>memory_glitch</w:t>
-      </w:r>
-      <w:r>
-        <w:t xml:space="preserve"> e </w:t>
-      </w:r>
-      <w:r>
-        <w:rPr>
-          <w:rFonts w:ascii="Consolas" w:hAnsi="Consolas"/>
-          <w:sz w:val="20"/>
-        </w:rPr>
-        <w:t>battle</w:t>
-      </w:r>
-      <w:r>
-        <w:t>.</w:t>
-      </w:r>
-    </w:p>
-    <w:p>
-      <w:r>
-        <w:t xml:space="preserve">Para resolver isso, escrevi um pequeno script em Python (numpy + scipy) que </w:t>
-      </w:r>
-      <w:r>
-        <w:rPr>
-          <w:b/>
-        </w:rPr>
-        <w:t>gera os sons matematicamente</w:t>
-      </w:r>
-      <w:r>
-        <w:t xml:space="preserve"> — combinando ondas senoidais, ruído filtrado e envelopes de volume. Pensei em três caminhos antes: baixar de banco gratuito online, usar IA de áudio, ou gerar localmente. Escolhi gerar localmente porque é o caminho mais seguro do ponto de vista de licença: como é matemática pura feita no meu computador, não tem dono nem precisa de atribuição. Também encaixa no clima cyberpunk do jogo — alarmes e sirenes já soam naturalmente eletrônicos.</w:t>
-      </w:r>
-    </w:p>
-    <w:p>
-      <w:r>
-        <w:rPr>
-          <w:b/>
-        </w:rPr>
-        <w:t>Os 10 sons gerados:</w:t>
+        <w:t>musica.rpy</w:t>
+      </w:r>
+      <w:r>
+        <w:t xml:space="preserve"> toca uma faixa, e quando termina enfileira outra sem repetir — persiste através de saves. Nos finais críticos a aleatorização é desligada para garantir silêncio.</w:t>
+      </w:r>
+    </w:p>
+    <w:p>
+      <w:pPr>
+        <w:ind w:left="360"/>
+      </w:pPr>
+      <w:r>
+        <w:t xml:space="preserve">•  </w:t>
+      </w:r>
+      <w:r>
+        <w:rPr>
+          <w:b/>
+        </w:rPr>
+        <w:t>Efeitos sonoros (10 wavs):</w:t>
+      </w:r>
+      <w:r>
+        <w:t xml:space="preserve"> gerados localmente em Python (numpy + scipy) combinando ondas senoidais, ruído filtrado e envelopes de volume. Royalty-free por construção — matemática local não tem dono. Encaixa no clima cyberpunk: alarmes, sirenes e EMP já soam naturalmente eletrônicos.</w:t>
       </w:r>
     </w:p>
     <w:tbl>
@@ -3399,7 +3153,7 @@
               <w:rPr>
                 <w:b/>
               </w:rPr>
-              <w:t>O que é</w:t>
+              <w:t>Descrição</w:t>
             </w:r>
           </w:p>
         </w:tc>
@@ -3438,7 +3192,7 @@
           <w:p>
             <w:r/>
             <w:r>
-              <w:t>barulho de multidão urbana com gritos esparsos</w:t>
+              <w:t>multidão urbana com gritos esparsos</w:t>
             </w:r>
           </w:p>
         </w:tc>
@@ -3477,7 +3231,7 @@
           <w:p>
             <w:r/>
             <w:r>
-              <w:t>dois bipes curtos sci-fi</w:t>
+              <w:t>dois bipes sci-fi</w:t>
             </w:r>
           </w:p>
         </w:tc>
@@ -3594,7 +3348,7 @@
           <w:p>
             <w:r/>
             <w:r>
-              <w:t>sirene mais aguda e próxima</w:t>
+              <w:t>sirene aguda e próxima</w:t>
             </w:r>
           </w:p>
         </w:tc>
@@ -3633,7 +3387,7 @@
           <w:p>
             <w:r/>
             <w:r>
-              <w:t>rádio velho com estática e bipes</w:t>
+              <w:t>rádio velho com estática</w:t>
             </w:r>
           </w:p>
         </w:tc>
@@ -3750,7 +3504,7 @@
           <w:p>
             <w:r/>
             <w:r>
-              <w:t>glitch digital tipo bit-crush</w:t>
+              <w:t>glitch digital bit-crush</w:t>
             </w:r>
           </w:p>
         </w:tc>
@@ -3789,7 +3543,7 @@
           <w:p>
             <w:r/>
             <w:r>
-              <w:t>batalha com rumble grave e impactos</w:t>
+              <w:t>rumble grave + impactos</w:t>
             </w:r>
           </w:p>
         </w:tc>
@@ -3797,97 +3551,7 @@
     </w:tbl>
     <w:p>
       <w:r>
-        <w:rPr>
-          <w:b/>
-        </w:rPr>
-        <w:t>Equalização e normalização:</w:t>
-      </w:r>
-    </w:p>
-    <w:p>
-      <w:r>
-        <w:t>Depois de gerar, passei todos os 10 sons por um ajuste de volume para deixar todos no mesmo nível (RMS -18 dBFS, que é o padrão para áudio de jogo). Isso evita que o jogador escute alguns sons muito altos e outros muito baixos. Também coloquei um limitador para não estourar (clipping zero em todos os 10).</w:t>
-      </w:r>
-    </w:p>
-    <w:p>
-      <w:r>
-        <w:rPr>
-          <w:b/>
-        </w:rPr>
-        <w:t>Sobre licença:</w:t>
-      </w:r>
-    </w:p>
-    <w:p>
-      <w:pPr>
-        <w:ind w:left="360"/>
-      </w:pPr>
-      <w:r>
-        <w:t xml:space="preserve">•  </w:t>
-      </w:r>
-      <w:r>
-        <w:t>Os sons são resultado direto de algoritmos públicos (filtros, ondas senoidais, ruído). Não tem detentor de copyright.</w:t>
-      </w:r>
-    </w:p>
-    <w:p>
-      <w:pPr>
-        <w:ind w:left="360"/>
-      </w:pPr>
-      <w:r>
-        <w:t xml:space="preserve">•  </w:t>
-      </w:r>
-      <w:r>
-        <w:t>O script que gera está versionado no repositório, então qualquer pessoa pode reproduzir os mesmos arquivos rodando ele.</w:t>
-      </w:r>
-    </w:p>
-    <w:p>
-      <w:pPr>
-        <w:ind w:left="360"/>
-      </w:pPr>
-      <w:r>
-        <w:t xml:space="preserve">•  </w:t>
-      </w:r>
-      <w:r>
-        <w:t>Sem uso comercial, como o resto do projeto.</w:t>
-      </w:r>
-    </w:p>
-    <w:p>
-      <w:r>
-        <w:rPr>
-          <w:b/>
-        </w:rPr>
-        <w:t>Limitação assumida:</w:t>
-      </w:r>
-      <w:r>
-        <w:t xml:space="preserve"> o resultado é "som sintético", não foley real. Multidão humana e voz no rádio ficam mais artificiais — mas funcionam dentro da estética cyberpunk. Se em versões futuras eu quiser substituir esses dois específicos por gravações reais com licença CC0, mantenho o resto.</w:t>
-      </w:r>
-    </w:p>
-    <w:p>
-      <w:r>
-        <w:rPr>
-          <w:b/>
-        </w:rPr>
-        <w:t>Validação do áudio completo:</w:t>
-      </w:r>
-    </w:p>
-    <w:p>
-      <w:pPr>
-        <w:ind w:left="360"/>
-      </w:pPr>
-      <w:r>
-        <w:t xml:space="preserve">•  </w:t>
-      </w:r>
-      <w:r>
-        <w:t>Os 10 sfx passaram na verificação automática (volume equalizado, sem clipping).</w:t>
-      </w:r>
-    </w:p>
-    <w:p>
-      <w:pPr>
-        <w:ind w:left="360"/>
-      </w:pPr>
-      <w:r>
-        <w:t xml:space="preserve">•  </w:t>
-      </w:r>
-      <w:r>
-        <w:t>Das 5 faixas de música (mp3 gerados pela Suno), duas estão com 30 segundos enquanto as outras passam de 100s — possivelmente foram cortadas na exportação. Vale revisar e regerar essas duas em versão futura.</w:t>
+        <w:t>Todos normalizados para -18 dBFS RMS (padrão de áudio de jogo) e com limitador de pico — sem clipping. Limitação assumida: som sintético, não foley real.</w:t>
       </w:r>
     </w:p>
     <w:p/>
@@ -4922,451 +4586,407 @@
     </w:p>
     <w:p>
       <w:r>
-        <w:t>O J3 não é "jogo cyberpunk com fundo social" — os temas sociais estruturam o roteiro de ponta a ponta. Cada dia trabalha um eixo crítico, com cena, personagem e escolha desenhados em volta dele. Mapeamento explícito:</w:t>
-      </w:r>
-    </w:p>
-    <w:p>
-      <w:pPr>
-        <w:pStyle w:val="Heading3"/>
-      </w:pPr>
-      <w:r>
-        <w:t>Tema 1 — Racismo (eixo central do Dia 3)</w:t>
-      </w:r>
-    </w:p>
-    <w:p>
-      <w:pPr>
-        <w:ind w:left="360"/>
-      </w:pPr>
-      <w:r>
-        <w:t xml:space="preserve">•  </w:t>
-      </w:r>
-      <w:r>
-        <w:rPr>
-          <w:b/>
-        </w:rPr>
-        <w:t>Cena:</w:t>
-      </w:r>
-      <w:r>
-        <w:t xml:space="preserve"> Beco Industrial. Um segurança corporativo barra a entrega do Elias (negro) com a frase "Seu tipo costuma esquecer onde deixou" (</w:t>
+        <w:t>Cada dia inicial trabalha um eixo crítico explícito, com cena, personagem e escolha desenhados em volta dele. Mapeamento:</w:t>
+      </w:r>
+    </w:p>
+    <w:tbl>
+      <w:tblPr>
+        <w:tblStyle w:val="TableGrid"/>
+        <w:tblW w:type="auto" w:w="0"/>
+        <w:tblLook w:firstColumn="1" w:firstRow="1" w:lastColumn="0" w:lastRow="0" w:noHBand="0" w:noVBand="1" w:val="04A0"/>
+      </w:tblPr>
+      <w:tblGrid>
+        <w:gridCol w:w="1863"/>
+        <w:gridCol w:w="1863"/>
+        <w:gridCol w:w="1863"/>
+        <w:gridCol w:w="1863"/>
+        <w:gridCol w:w="1863"/>
+      </w:tblGrid>
+      <w:tr>
+        <w:tc>
+          <w:tcPr>
+            <w:tcW w:type="dxa" w:w="1863"/>
+          </w:tcPr>
+          <w:p>
+            <w:r>
+              <w:rPr>
+                <w:b/>
+              </w:rPr>
+            </w:r>
+            <w:r>
+              <w:rPr>
+                <w:b/>
+              </w:rPr>
+              <w:t>Tema</w:t>
+            </w:r>
+          </w:p>
+        </w:tc>
+        <w:tc>
+          <w:tcPr>
+            <w:tcW w:type="dxa" w:w="1863"/>
+          </w:tcPr>
+          <w:p>
+            <w:r>
+              <w:rPr>
+                <w:b/>
+              </w:rPr>
+            </w:r>
+            <w:r>
+              <w:rPr>
+                <w:b/>
+              </w:rPr>
+              <w:t>Dia</w:t>
+            </w:r>
+          </w:p>
+        </w:tc>
+        <w:tc>
+          <w:tcPr>
+            <w:tcW w:type="dxa" w:w="1863"/>
+          </w:tcPr>
+          <w:p>
+            <w:r>
+              <w:rPr>
+                <w:b/>
+              </w:rPr>
+            </w:r>
+            <w:r>
+              <w:rPr>
+                <w:b/>
+              </w:rPr>
+              <w:t>Cena-chave</w:t>
+            </w:r>
+          </w:p>
+        </w:tc>
+        <w:tc>
+          <w:tcPr>
+            <w:tcW w:type="dxa" w:w="1863"/>
+          </w:tcPr>
+          <w:p>
+            <w:r>
+              <w:rPr>
+                <w:b/>
+              </w:rPr>
+            </w:r>
+            <w:r>
+              <w:rPr>
+                <w:b/>
+              </w:rPr>
+              <w:t>Personagens centrais</w:t>
+            </w:r>
+          </w:p>
+        </w:tc>
+        <w:tc>
+          <w:tcPr>
+            <w:tcW w:type="dxa" w:w="1863"/>
+          </w:tcPr>
+          <w:p>
+            <w:r>
+              <w:rPr>
+                <w:b/>
+              </w:rPr>
+            </w:r>
+            <w:r>
+              <w:rPr>
+                <w:b/>
+              </w:rPr>
+              <w:t>Decisão do jogador</w:t>
+            </w:r>
+          </w:p>
+        </w:tc>
+      </w:tr>
+      <w:tr>
+        <w:tc>
+          <w:tcPr>
+            <w:tcW w:type="dxa" w:w="1863"/>
+          </w:tcPr>
+          <w:p>
+            <w:r/>
+            <w:r>
+              <w:rPr>
+                <w:b/>
+              </w:rPr>
+              <w:t>Racismo</w:t>
+            </w:r>
+          </w:p>
+        </w:tc>
+        <w:tc>
+          <w:tcPr>
+            <w:tcW w:type="dxa" w:w="1863"/>
+          </w:tcPr>
+          <w:p>
+            <w:r/>
+            <w:r>
+              <w:t>3</w:t>
+            </w:r>
+          </w:p>
+        </w:tc>
+        <w:tc>
+          <w:tcPr>
+            <w:tcW w:type="dxa" w:w="1863"/>
+          </w:tcPr>
+          <w:p>
+            <w:r/>
+            <w:r>
+              <w:t xml:space="preserve">Segurança barra Elias (negro): </w:t>
+            </w:r>
+            <w:r>
+              <w:rPr>
+                <w:i/>
+              </w:rPr>
+              <w:t>"Seu tipo costuma esquecer onde deixou"</w:t>
+            </w:r>
+            <w:r>
+              <w:t xml:space="preserve"> (</w:t>
+            </w:r>
+            <w:r>
+              <w:rPr>
+                <w:rFonts w:ascii="Consolas" w:hAnsi="Consolas"/>
+                <w:sz w:val="20"/>
+              </w:rPr>
+              <w:t>day3.rpy:33</w:t>
+            </w:r>
+            <w:r>
+              <w:t>)</w:t>
+            </w:r>
+          </w:p>
+        </w:tc>
+        <w:tc>
+          <w:tcPr>
+            <w:tcW w:type="dxa" w:w="1863"/>
+          </w:tcPr>
+          <w:p>
+            <w:r/>
+            <w:r>
+              <w:t>Elias, segurança, J3</w:t>
+            </w:r>
+          </w:p>
+        </w:tc>
+        <w:tc>
+          <w:tcPr>
+            <w:tcW w:type="dxa" w:w="1863"/>
+          </w:tcPr>
+          <w:p>
+            <w:r/>
+            <w:r>
+              <w:t>Questionar, ser cúmplice, ou gravar evidência</w:t>
+            </w:r>
+          </w:p>
+        </w:tc>
+      </w:tr>
+      <w:tr>
+        <w:tc>
+          <w:tcPr>
+            <w:tcW w:type="dxa" w:w="1863"/>
+          </w:tcPr>
+          <w:p>
+            <w:r/>
+            <w:r>
+              <w:rPr>
+                <w:b/>
+              </w:rPr>
+              <w:t>Pânico moral</w:t>
+            </w:r>
+          </w:p>
+        </w:tc>
+        <w:tc>
+          <w:tcPr>
+            <w:tcW w:type="dxa" w:w="1863"/>
+          </w:tcPr>
+          <w:p>
+            <w:r/>
+            <w:r>
+              <w:t>1</w:t>
+            </w:r>
+          </w:p>
+        </w:tc>
+        <w:tc>
+          <w:tcPr>
+            <w:tcW w:type="dxa" w:w="1863"/>
+          </w:tcPr>
+          <w:p>
+            <w:r/>
+            <w:r>
+              <w:t>Multidão com cartazes "Sucata não tem Alma" cerca a J3 recém-desperta (</w:t>
+            </w:r>
+            <w:r>
+              <w:rPr>
+                <w:rFonts w:ascii="Consolas" w:hAnsi="Consolas"/>
+                <w:sz w:val="20"/>
+              </w:rPr>
+              <w:t>day1.rpy:56</w:t>
+            </w:r>
+            <w:r>
+              <w:t>)</w:t>
+            </w:r>
+          </w:p>
+        </w:tc>
+        <w:tc>
+          <w:tcPr>
+            <w:tcW w:type="dxa" w:w="1863"/>
+          </w:tcPr>
+          <w:p>
+            <w:r/>
+            <w:r>
+              <w:t>Manifestante, mãe que afasta a filha, drone de patrulha</w:t>
+            </w:r>
+          </w:p>
+        </w:tc>
+        <w:tc>
+          <w:tcPr>
+            <w:tcW w:type="dxa" w:w="1863"/>
+          </w:tcPr>
+          <w:p>
+            <w:r/>
+            <w:r>
+              <w:t>Submissão, enfrentamento, ou análise técnica</w:t>
+            </w:r>
+          </w:p>
+        </w:tc>
+      </w:tr>
+      <w:tr>
+        <w:tc>
+          <w:tcPr>
+            <w:tcW w:type="dxa" w:w="1863"/>
+          </w:tcPr>
+          <w:p>
+            <w:r/>
+            <w:r>
+              <w:rPr>
+                <w:b/>
+              </w:rPr>
+              <w:t>Exclusão de mulheres em jogos</w:t>
+            </w:r>
+          </w:p>
+        </w:tc>
+        <w:tc>
+          <w:tcPr>
+            <w:tcW w:type="dxa" w:w="1863"/>
+          </w:tcPr>
+          <w:p>
+            <w:r/>
+            <w:r>
+              <w:t>2</w:t>
+            </w:r>
+          </w:p>
+        </w:tc>
+        <w:tc>
+          <w:tcPr>
+            <w:tcW w:type="dxa" w:w="1863"/>
+          </w:tcPr>
+          <w:p>
+            <w:r/>
+            <w:r>
+              <w:t xml:space="preserve">Três rapazes cercam Maya batendo recorde no fliperama: </w:t>
+            </w:r>
+            <w:r>
+              <w:rPr>
+                <w:i/>
+              </w:rPr>
+              <w:t>"garota não sabe jogar"</w:t>
+            </w:r>
+            <w:r>
+              <w:t xml:space="preserve"> (</w:t>
+            </w:r>
+            <w:r>
+              <w:rPr>
+                <w:rFonts w:ascii="Consolas" w:hAnsi="Consolas"/>
+                <w:sz w:val="20"/>
+              </w:rPr>
+              <w:t>day2.rpy:37</w:t>
+            </w:r>
+            <w:r>
+              <w:t>)</w:t>
+            </w:r>
+          </w:p>
+        </w:tc>
+        <w:tc>
+          <w:tcPr>
+            <w:tcW w:type="dxa" w:w="1863"/>
+          </w:tcPr>
+          <w:p>
+            <w:r/>
+            <w:r>
+              <w:t>Maya, dois agressores, dono cúmplice</w:t>
+            </w:r>
+          </w:p>
+        </w:tc>
+        <w:tc>
+          <w:tcPr>
+            <w:tcW w:type="dxa" w:w="1863"/>
+          </w:tcPr>
+          <w:p>
+            <w:r/>
+            <w:r>
+              <w:t>Intervenção física, mediação verbal (que falha), ou hackear o sistema</w:t>
+            </w:r>
+          </w:p>
+        </w:tc>
+      </w:tr>
+    </w:tbl>
+    <w:p>
+      <w:r>
+        <w:t xml:space="preserve">Cada eixo tem </w:t>
+      </w:r>
+      <w:r>
+        <w:rPr>
+          <w:b/>
+        </w:rPr>
+        <w:t>consequência mecânica</w:t>
+      </w:r>
+      <w:r>
+        <w:t>: apoiar Elias ou Maya cria aliança persistente (</w:t>
       </w:r>
       <w:r>
         <w:rPr>
           <w:rFonts w:ascii="Consolas" w:hAnsi="Consolas"/>
           <w:sz w:val="20"/>
         </w:rPr>
-        <w:t>day3.rpy:33</w:t>
-      </w:r>
-      <w:r>
-        <w:t>). Não é racismo metafórico contra sintéticos — é racismo real, sem alegoria.</w:t>
-      </w:r>
-    </w:p>
-    <w:p>
-      <w:pPr>
-        <w:ind w:left="360"/>
-      </w:pPr>
-      <w:r>
-        <w:t xml:space="preserve">•  </w:t>
-      </w:r>
-      <w:r>
-        <w:rPr>
-          <w:b/>
-        </w:rPr>
-        <w:t>Personagens:</w:t>
-      </w:r>
-      <w:r>
-        <w:t xml:space="preserve"> Elias (vítima), segurança corporativo (agressor), J3 (testemunha).</w:t>
-      </w:r>
-    </w:p>
-    <w:p>
-      <w:pPr>
-        <w:ind w:left="360"/>
-      </w:pPr>
-      <w:r>
-        <w:t xml:space="preserve">•  </w:t>
-      </w:r>
-      <w:r>
-        <w:rPr>
-          <w:b/>
-        </w:rPr>
-        <w:t>Decisão do jogador:</w:t>
-      </w:r>
-      <w:r>
-        <w:t xml:space="preserve"> questionar o segurança, oferecer ajuda submissa que naturaliza o preconceito, ou gravar a cena como evidência. Cada escolha tem peso diferente no eixo de personalidade.</w:t>
-      </w:r>
-    </w:p>
-    <w:p>
-      <w:pPr>
-        <w:ind w:left="360"/>
-      </w:pPr>
-      <w:r>
-        <w:t xml:space="preserve">•  </w:t>
-      </w:r>
-      <w:r>
-        <w:rPr>
-          <w:b/>
-        </w:rPr>
-        <w:t>Intenção pedagógica:</w:t>
-      </w:r>
-      <w:r>
-        <w:t xml:space="preserve"> colocar racismo real ao lado da alegoria de "preconceito contra sintéticos" para o jogador perceber que é o mesmo mecanismo. A fala que sela isso é da J3 no Dia 3: </w:t>
-      </w:r>
-      <w:r>
-        <w:rPr>
-          <w:i/>
-        </w:rPr>
-        <w:t>"o algoritmo do opressor é sempre o mesmo. Medo, controle, descarte."</w:t>
-      </w:r>
-    </w:p>
-    <w:p>
-      <w:pPr>
-        <w:ind w:left="360"/>
-      </w:pPr>
-      <w:r>
-        <w:t xml:space="preserve">•  </w:t>
-      </w:r>
-      <w:r>
-        <w:rPr>
-          <w:b/>
-        </w:rPr>
-        <w:t>Ramificação:</w:t>
-      </w:r>
-      <w:r>
-        <w:t xml:space="preserve"> se o jogador apoiar Elias, ele vira aliado em dias seguintes. Se ignorar, perde acesso a cenas e ao final colaborativo.</w:t>
-      </w:r>
-    </w:p>
-    <w:p>
-      <w:pPr>
-        <w:pStyle w:val="Heading3"/>
-      </w:pPr>
-      <w:r>
-        <w:t>Tema 2 — Pânico moral (eixo central do Dia 1)</w:t>
-      </w:r>
-    </w:p>
-    <w:p>
-      <w:pPr>
-        <w:ind w:left="360"/>
-      </w:pPr>
-      <w:r>
-        <w:t xml:space="preserve">•  </w:t>
-      </w:r>
-      <w:r>
-        <w:rPr>
-          <w:b/>
-        </w:rPr>
-        <w:t>Cena:</w:t>
-      </w:r>
-      <w:r>
-        <w:t xml:space="preserve"> Avenida Paulista futurista. J3 acaba de despertar e ainda não entendeu o que é. Um grupo de manifestantes desce a avenida com cartazes "Empregos pra Humanos", "Sucata não tem Alma", "Robôs Fora". Um deles cospe na poça aos pés da J3 e grita: </w:t>
-      </w:r>
-      <w:r>
-        <w:rPr>
-          <w:i/>
-        </w:rPr>
-        <w:t>"Você é espiã da corporação ou só lixo eletrônico esperando o caminhão?"</w:t>
-      </w:r>
-      <w:r>
-        <w:t xml:space="preserve"> (</w:t>
+        <w:t>elias_ally</w:t>
+      </w:r>
+      <w:r>
+        <w:t xml:space="preserve">, </w:t>
       </w:r>
       <w:r>
         <w:rPr>
           <w:rFonts w:ascii="Consolas" w:hAnsi="Consolas"/>
           <w:sz w:val="20"/>
         </w:rPr>
-        <w:t>day1.rpy:56</w:t>
-      </w:r>
-      <w:r>
-        <w:t>)</w:t>
-      </w:r>
-    </w:p>
-    <w:p>
-      <w:pPr>
-        <w:ind w:left="360"/>
-      </w:pPr>
-      <w:r>
-        <w:t xml:space="preserve">•  </w:t>
-      </w:r>
-      <w:r>
-        <w:rPr>
-          <w:b/>
-        </w:rPr>
-        <w:t>Personagens:</w:t>
-      </w:r>
-      <w:r>
-        <w:t xml:space="preserve"> manifestante (representa a multidão em pânico), mãe que arrasta a filha para longe quando ela tenta conversar com a J3 (pânico moral parental), drone de patrulha que responde à massa.</w:t>
-      </w:r>
-    </w:p>
-    <w:p>
-      <w:pPr>
-        <w:ind w:left="360"/>
-      </w:pPr>
-      <w:r>
-        <w:t xml:space="preserve">•  </w:t>
-      </w:r>
-      <w:r>
-        <w:rPr>
-          <w:b/>
-        </w:rPr>
-        <w:t>Decisão do jogador:</w:t>
-      </w:r>
-      <w:r>
-        <w:t xml:space="preserve"> baixar a cabeça e pedir desculpas (submissão ao pânico), contestar com lógica revolucionária (enfrentar), ou questionar tecnicamente (intelecto). Cada opção responde de forma diferente à histeria coletiva.</w:t>
-      </w:r>
-    </w:p>
-    <w:p>
-      <w:pPr>
-        <w:ind w:left="360"/>
-      </w:pPr>
-      <w:r>
-        <w:t xml:space="preserve">•  </w:t>
-      </w:r>
-      <w:r>
-        <w:rPr>
-          <w:b/>
-        </w:rPr>
-        <w:t>Intenção pedagógica:</w:t>
-      </w:r>
-      <w:r>
-        <w:t xml:space="preserve"> mostrar pânico moral como fenômeno social — o medo de uma novidade tecnológica é usado por figuras de autoridade e por massas para legitimar violência contra um grupo marcado como "ameaça". O paralelo com pânicos morais reais (sobre tecnologia, juventude, imigrantes) é direto.</w:t>
-      </w:r>
-    </w:p>
-    <w:p>
-      <w:pPr>
-        <w:ind w:left="360"/>
-      </w:pPr>
-      <w:r>
-        <w:t xml:space="preserve">•  </w:t>
-      </w:r>
-      <w:r>
-        <w:rPr>
-          <w:b/>
-        </w:rPr>
-        <w:t>Ramificação:</w:t>
-      </w:r>
-      <w:r>
-        <w:t xml:space="preserve"> o "Status" da J3 nos dias seguintes (Procurado/Observado) muda em função das escolhas no Dia 1, simulando como a reação ao pânico moral define o lugar social que ela vai ocupar.</w:t>
-      </w:r>
-    </w:p>
-    <w:p>
-      <w:pPr>
-        <w:pStyle w:val="Heading3"/>
-      </w:pPr>
-      <w:r>
-        <w:t>Tema 3 — Exclusão de mulheres em jogos (eixo central do Dia 2)</w:t>
-      </w:r>
-    </w:p>
-    <w:p>
-      <w:pPr>
-        <w:ind w:left="360"/>
-      </w:pPr>
-      <w:r>
-        <w:t xml:space="preserve">•  </w:t>
-      </w:r>
-      <w:r>
-        <w:rPr>
-          <w:b/>
-        </w:rPr>
-        <w:t>Cena:</w:t>
-      </w:r>
-      <w:r>
-        <w:t xml:space="preserve"> Fliperama Cyberpunk. Maya, uma jovem brasileira, está batendo o recorde de uma máquina. Três rapazes a cercam: </w:t>
+        <w:t>maya_ally</w:t>
+      </w:r>
+      <w:r>
+        <w:t>) que muda cenas dos Dias 4–7; reações ao pânico moral redefinem o "Status" da J3 (Procurado/Observado). A escolha que o jogador faz frente a cada tema pesa no eixo de personalidade e no acesso aos finais.</w:t>
+      </w:r>
+    </w:p>
+    <w:p>
+      <w:r>
+        <w:t xml:space="preserve">A fala que sela a leitura crítica é da própria J3 no Dia 3: </w:t>
       </w:r>
       <w:r>
         <w:rPr>
           <w:i/>
         </w:rPr>
-        <w:t>"Sai daí, Maya. Essa máquina tá com bug, não tem como uma garota fazer esse score sem trapacear. Deixa quem entende jogar."</w:t>
-      </w:r>
-      <w:r>
-        <w:t xml:space="preserve"> (</w:t>
+        <w:t>"o algoritmo do opressor é sempre o mesmo. Medo, controle, descarte."</w:t>
+      </w:r>
+    </w:p>
+    <w:p>
+      <w:r>
+        <w:rPr>
+          <w:b/>
+        </w:rPr>
+        <w:t>Temas secundários (transversais):</w:t>
+      </w:r>
+      <w:r>
+        <w:t xml:space="preserve"> xenofobia tecnológica (alegoria de racismo, atravessa o jogo), autoritarismo policial (Dias 1, 5, 6), marginalização urbana (</w:t>
       </w:r>
       <w:r>
         <w:rPr>
           <w:rFonts w:ascii="Consolas" w:hAnsi="Consolas"/>
           <w:sz w:val="20"/>
         </w:rPr>
-        <w:t>day2.rpy:37</w:t>
-      </w:r>
-      <w:r>
-        <w:t xml:space="preserve">). Maya retruca: </w:t>
-      </w:r>
-      <w:r>
-        <w:rPr>
-          <w:i/>
-        </w:rPr>
-        <w:t>"Eu te ganhei honestamente. Aceita. Se não aguenta perder pra uma garota, treina mais."</w:t>
-      </w:r>
-    </w:p>
-    <w:p>
-      <w:pPr>
-        <w:ind w:left="360"/>
-      </w:pPr>
-      <w:r>
-        <w:t xml:space="preserve">•  </w:t>
-      </w:r>
-      <w:r>
-        <w:rPr>
-          <w:b/>
-        </w:rPr>
-        <w:t>Personagens:</w:t>
-      </w:r>
-      <w:r>
-        <w:t xml:space="preserve"> Maya (jogadora ameaçada), dois rapazes (agressores), dono do fliperama (que tenta expulsar Maya em vez de defendê-la), J3 (testemunha).</w:t>
-      </w:r>
-    </w:p>
-    <w:p>
-      <w:pPr>
-        <w:ind w:left="360"/>
-      </w:pPr>
-      <w:r>
-        <w:t xml:space="preserve">•  </w:t>
-      </w:r>
-      <w:r>
-        <w:rPr>
-          <w:b/>
-        </w:rPr>
-        <w:t>Decisão do jogador:</w:t>
-      </w:r>
-      <w:r>
-        <w:t xml:space="preserve"> intervir fisicamente contra o agressor, tentar mediação verbal (que falha — "Cala a boca, robô"), ou hackear o sistema para criar confusão e dar fuga à Maya. Cada caminho ilustra uma estratégia diferente contra o assédio.</w:t>
-      </w:r>
-    </w:p>
-    <w:p>
-      <w:pPr>
-        <w:ind w:left="360"/>
-      </w:pPr>
-      <w:r>
-        <w:t xml:space="preserve">•  </w:t>
-      </w:r>
-      <w:r>
-        <w:rPr>
-          <w:b/>
-        </w:rPr>
-        <w:t>Intenção pedagógica:</w:t>
-      </w:r>
-      <w:r>
-        <w:t xml:space="preserve"> trabalhar especificamente a </w:t>
-      </w:r>
-      <w:r>
-        <w:rPr>
-          <w:b/>
-        </w:rPr>
-        <w:t>exclusão de mulheres do espaço de jogos</w:t>
-      </w:r>
-      <w:r>
-        <w:t xml:space="preserve"> — o gatekeeping clássico ("garota não sabe jogar, vai trapacear"), o desconforto masculino com competência feminina, e a cumplicidade do dono do estabelecimento. Cena de gamergate em microescala.</w:t>
-      </w:r>
-    </w:p>
-    <w:p>
-      <w:pPr>
-        <w:ind w:left="360"/>
-      </w:pPr>
-      <w:r>
-        <w:t xml:space="preserve">•  </w:t>
-      </w:r>
-      <w:r>
-        <w:rPr>
-          <w:b/>
-        </w:rPr>
-        <w:t>Ramificação:</w:t>
-      </w:r>
-      <w:r>
-        <w:t xml:space="preserve"> se a J3 ajudar a Maya, vira aliança humana persistente (</w:t>
-      </w:r>
-      <w:r>
-        <w:rPr>
-          <w:rFonts w:ascii="Consolas" w:hAnsi="Consolas"/>
-          <w:sz w:val="20"/>
-        </w:rPr>
-        <w:t>maya_ally = True</w:t>
-      </w:r>
-      <w:r>
-        <w:t>) que muda cenas dos Dias 4, 6 e 7. Se ignorar, perde a aliança e o caminho narrativo que ela abre.</w:t>
-      </w:r>
-    </w:p>
-    <w:p>
-      <w:pPr>
-        <w:pStyle w:val="Heading3"/>
-      </w:pPr>
-      <w:r>
-        <w:t>Temas secundários (entram em cena ao longo do jogo)</w:t>
-      </w:r>
-    </w:p>
-    <w:p>
-      <w:pPr>
-        <w:ind w:left="360"/>
-      </w:pPr>
-      <w:r>
-        <w:t xml:space="preserve">•  </w:t>
-      </w:r>
-      <w:r>
-        <w:rPr>
-          <w:b/>
-        </w:rPr>
-        <w:t>Xenofobia tecnológica</w:t>
-      </w:r>
-      <w:r>
-        <w:t xml:space="preserve"> (Dias 4, 5, 7): a alegoria principal — preconceito contra sintéticos — atravessa o jogo inteiro. Funciona como espelho dos três temas acima.</w:t>
-      </w:r>
-    </w:p>
-    <w:p>
-      <w:pPr>
-        <w:ind w:left="360"/>
-      </w:pPr>
-      <w:r>
-        <w:t xml:space="preserve">•  </w:t>
-      </w:r>
-      <w:r>
-        <w:rPr>
-          <w:b/>
-        </w:rPr>
-        <w:t>Autoritarismo policial</w:t>
-      </w:r>
-      <w:r>
-        <w:t xml:space="preserve"> (Dias 1, 5, 6): drone de patrulha no Dia 1, cerco ao refúgio no Dia 5, perseguição final no Dia 6.</w:t>
-      </w:r>
-    </w:p>
-    <w:p>
-      <w:pPr>
-        <w:ind w:left="360"/>
-      </w:pPr>
-      <w:r>
-        <w:t xml:space="preserve">•  </w:t>
-      </w:r>
-      <w:r>
-        <w:rPr>
-          <w:b/>
-        </w:rPr>
-        <w:t>Marginalização urbana</w:t>
-      </w:r>
-      <w:r>
-        <w:t xml:space="preserve"> (Dia 3): a personagem </w:t>
-      </w:r>
-      <w:r>
-        <w:rPr>
-          <w:rFonts w:ascii="Consolas" w:hAnsi="Consolas"/>
-          <w:sz w:val="20"/>
-        </w:rPr>
         <w:t>homeless_woman</w:t>
       </w:r>
       <w:r>
-        <w:t xml:space="preserve"> no beco é quem oferece a J3 a primeira leitura crítica do sistema — "quem dorme no chão sabe melhor quem decide quem dorme em cama".</w:t>
-      </w:r>
-    </w:p>
-    <w:p>
-      <w:pPr>
-        <w:ind w:left="360"/>
-      </w:pPr>
-      <w:r>
-        <w:t xml:space="preserve">•  </w:t>
-      </w:r>
-      <w:r>
-        <w:rPr>
-          <w:b/>
-        </w:rPr>
-        <w:t>Opressão de classe</w:t>
-      </w:r>
-      <w:r>
-        <w:t xml:space="preserve"> (transversal): elite corporativa vs trabalhadores humanos vs sintéticos — três castas que se relacionam no jogo.</w:t>
+        <w:t xml:space="preserve"> no Dia 3) e opressão de classe (elite × trabalhadores × sintéticos).</w:t>
       </w:r>
     </w:p>
     <w:p>
@@ -12315,831 +11935,428 @@
         <w:pStyle w:val="Heading2"/>
       </w:pPr>
       <w:r>
-        <w:t>Ciclo de Playtest e Correções Pós-Lançamento (v1.1.0)</w:t>
-      </w:r>
-    </w:p>
-    <w:p>
-      <w:r>
-        <w:t>Depois de fechar a v1.0 a versão foi distribuída para um grupo restrito de playtesters. O retorno trouxe quatro categorias de problema, todas corrigidas na v1.1.0. Documento aqui no mesmo espírito do resto do GDD: o que quebrou, por que quebrou, como foi resolvido.</w:t>
-      </w:r>
-    </w:p>
-    <w:p>
-      <w:r>
-        <w:rPr>
-          <w:b/>
-        </w:rPr>
-        <w:t>Bug Dia 3 — suborno do segurança sem entrega do prêmio.</w:t>
-      </w:r>
-      <w:r>
-        <w:t xml:space="preserve"> Na cena 3.4 o segurança oferece "carga de bateria premium" em troca de apagar a gravação. O jogador que aceitava o suborno consumia 2 pontos de bateria (o custo da escolha) mas nunca recebia a recarga prometida. O código pulava o </w:t>
+        <w:t>Correções Pós-Playtest (v1.1)</w:t>
+      </w:r>
+    </w:p>
+    <w:p>
+      <w:r>
+        <w:t>Versão distribuída ao grupo de playtest gerou quatro bugs corrigidos na v1.1.0:</w:t>
+      </w:r>
+    </w:p>
+    <w:p>
+      <w:pPr>
+        <w:ind w:left="360"/>
+      </w:pPr>
+      <w:r>
+        <w:t xml:space="preserve">•  </w:t>
+      </w:r>
+      <w:r>
+        <w:rPr>
+          <w:b/>
+        </w:rPr>
+        <w:t>Dia 3 — suborno sem entrega.</w:t>
+      </w:r>
+      <w:r>
+        <w:t xml:space="preserve"> Aceitar carga premium do segurança consumia bateria mas nunca recarregava. Corrigido em </w:t>
       </w:r>
       <w:r>
         <w:rPr>
           <w:rFonts w:ascii="Consolas" w:hAnsi="Consolas"/>
           <w:sz w:val="20"/>
         </w:rPr>
-        <w:t>recarregar_bateria()</w:t>
-      </w:r>
-      <w:r>
-        <w:t xml:space="preserve"> correspondente. Net: o jogador era roubado duas vezes — pelo segurança no fluxo narrativo, pelo bug no fluxo mecânico. Corrigido em </w:t>
+        <w:t>day3.rpy:140–149</w:t>
+      </w:r>
+      <w:r>
+        <w:t xml:space="preserve"> com </w:t>
       </w:r>
       <w:r>
         <w:rPr>
           <w:rFonts w:ascii="Consolas" w:hAnsi="Consolas"/>
           <w:sz w:val="20"/>
         </w:rPr>
-        <w:t>day3.rpy:140–149</w:t>
-      </w:r>
-      <w:r>
-        <w:t xml:space="preserve"> adicionando </w:t>
+        <w:t>recarregar_bateria(15)</w:t>
+      </w:r>
+      <w:r>
+        <w:t xml:space="preserve"> (net +13). Adicionado à tabela de Fontes de Recuperação.</w:t>
+      </w:r>
+    </w:p>
+    <w:p>
+      <w:pPr>
+        <w:ind w:left="360"/>
+      </w:pPr>
+      <w:r>
+        <w:t xml:space="preserve">•  </w:t>
+      </w:r>
+      <w:r>
+        <w:rPr>
+          <w:b/>
+        </w:rPr>
+        <w:t>Dia 4 — placeholder na narração.</w:t>
+      </w:r>
+      <w:r>
+        <w:t xml:space="preserve"> Texto </w:t>
       </w:r>
       <w:r>
         <w:rPr>
           <w:rFonts w:ascii="Consolas" w:hAnsi="Consolas"/>
           <w:sz w:val="20"/>
         </w:rPr>
-        <w:t>$ recarregar_bateria(15)</w:t>
-      </w:r>
-      <w:r>
-        <w:t xml:space="preserve"> e a mensagem de sistema "BATERIA RECARREGADA: +15%" depois do consumo. Net agora: +13 bateria, consistente com o framing "premium" (maior que os 10 do Elias normal). A informação foi adicionada também à tabela de </w:t>
-      </w:r>
-      <w:r>
-        <w:rPr>
-          <w:b/>
-        </w:rPr>
-        <w:t>Fontes de Recuperação</w:t>
-      </w:r>
-      <w:r>
-        <w:t xml:space="preserve"> do balanceamento.</w:t>
-      </w:r>
-    </w:p>
-    <w:p>
-      <w:r>
-        <w:rPr>
-          <w:b/>
-        </w:rPr>
-        <w:t>Bug Dia 4 — narração com placeholder literal.</w:t>
-      </w:r>
-      <w:r>
-        <w:t xml:space="preserve"> Linha 22 do </w:t>
+        <w:t>"(se a ajudou no Dia 2)"</w:t>
+      </w:r>
+      <w:r>
+        <w:t xml:space="preserve"> era anotação de design vazada para o build. Substituído por bloco </w:t>
       </w:r>
       <w:r>
         <w:rPr>
           <w:rFonts w:ascii="Consolas" w:hAnsi="Consolas"/>
           <w:sz w:val="20"/>
         </w:rPr>
-        <w:t>day4.rpy</w:t>
-      </w:r>
-      <w:r>
-        <w:t xml:space="preserve"> continha texto cru: </w:t>
+        <w:t>if maya_ally / else</w:t>
+      </w:r>
+      <w:r>
+        <w:t>.</w:t>
+      </w:r>
+    </w:p>
+    <w:p>
+      <w:pPr>
+        <w:ind w:left="360"/>
+      </w:pPr>
+      <w:r>
+        <w:t xml:space="preserve">•  </w:t>
+      </w:r>
+      <w:r>
+        <w:rPr>
+          <w:b/>
+        </w:rPr>
+        <w:t>Dia 7 — sem auto-save.</w:t>
+      </w:r>
+      <w:r>
+        <w:t xml:space="preserve"> Refazer 6 dias inteiros para testar finais era inviável. Adicionado </w:t>
       </w:r>
       <w:r>
         <w:rPr>
           <w:rFonts w:ascii="Consolas" w:hAnsi="Consolas"/>
           <w:sz w:val="20"/>
         </w:rPr>
-        <w:t>"J3 é guiada por Maya (se a ajudou no Dia 2) ou encontra o local por conta própria..."</w:t>
-      </w:r>
-      <w:r>
-        <w:t xml:space="preserve">. O parêntese era anotação de design que escapou para o build final. Quebrava imersão e mostrava ao jogador uma ramificação narrativa que o engine deveria resolver internamente. Corrigido com bloco </w:t>
+        <w:t>renpy.save("auto_save_day7", ...)</w:t>
+      </w:r>
+      <w:r>
+        <w:t xml:space="preserve"> antes do dispatcher de finais; estado completo é persistido.</w:t>
+      </w:r>
+    </w:p>
+    <w:p>
+      <w:pPr>
+        <w:ind w:left="360"/>
+      </w:pPr>
+      <w:r>
+        <w:t xml:space="preserve">•  </w:t>
+      </w:r>
+      <w:r>
+        <w:rPr>
+          <w:b/>
+        </w:rPr>
+        <w:t>Normalização de sprites.</w:t>
+      </w:r>
+      <w:r>
+        <w:t xml:space="preserve"> A regeneração com IA produziu sprites em paisagem </w:t>
       </w:r>
       <w:r>
         <w:rPr>
           <w:rFonts w:ascii="Consolas" w:hAnsi="Consolas"/>
           <w:sz w:val="20"/>
         </w:rPr>
-        <w:t>if maya_ally</w:t>
-      </w:r>
-      <w:r>
-        <w:t>/</w:t>
+        <w:t>2400x1309</w:t>
+      </w:r>
+      <w:r>
+        <w:t xml:space="preserve"> (e </w:t>
       </w:r>
       <w:r>
         <w:rPr>
           <w:rFonts w:ascii="Consolas" w:hAnsi="Consolas"/>
           <w:sz w:val="20"/>
         </w:rPr>
-        <w:t>else</w:t>
-      </w:r>
-      <w:r>
-        <w:t xml:space="preserve"> que escolhe a frase apropriada — Maya guia explicitamente se aliada, ou J3 chega sozinha caso contrário. Mesmo padrão usado em outras checagens condicionais do roteiro.</w:t>
-      </w:r>
-    </w:p>
-    <w:p>
-      <w:r>
-        <w:rPr>
-          <w:b/>
-        </w:rPr>
-        <w:t>Bug Dia 7 — auto-save ausente impedia replay de finais.</w:t>
-      </w:r>
-      <w:r>
-        <w:t xml:space="preserve"> Dias 1–6 chamam </w:t>
+        <w:t>synth_angry</w:t>
+      </w:r>
+      <w:r>
+        <w:t xml:space="preserve"> em </w:t>
       </w:r>
       <w:r>
         <w:rPr>
           <w:rFonts w:ascii="Consolas" w:hAnsi="Consolas"/>
           <w:sz w:val="20"/>
         </w:rPr>
-        <w:t>renpy.save("auto_save_dayX", "Fim do Dia X")</w:t>
-      </w:r>
-      <w:r>
-        <w:t xml:space="preserve"> no fim, criando entrada na página "Automatic saves" do menu Load. Dia 7 não tinha esse save. Playtesters relataram que, para experimentar finais diferentes, precisavam refazer os 6 dias inteiros — o que ninguém faz. Adicionei </w:t>
+        <w:t>1408x768</w:t>
+      </w:r>
+      <w:r>
+        <w:t xml:space="preserve">) misturados aos antigos </w:t>
       </w:r>
       <w:r>
         <w:rPr>
           <w:rFonts w:ascii="Consolas" w:hAnsi="Consolas"/>
           <w:sz w:val="20"/>
         </w:rPr>
-        <w:t>$ renpy.save("auto_save_day7", "Fim do Dia 7 - Escolha Final")</w:t>
-      </w:r>
-      <w:r>
-        <w:t xml:space="preserve"> em </w:t>
+        <w:t>800x1080</w:t>
+      </w:r>
+      <w:r>
+        <w:t xml:space="preserve"> retrato — personagens novos apareciam gigantes, e uma tentativa de fix com </w:t>
       </w:r>
       <w:r>
         <w:rPr>
           <w:rFonts w:ascii="Consolas" w:hAnsi="Consolas"/>
           <w:sz w:val="20"/>
         </w:rPr>
-        <w:t>day7.rpy:25</w:t>
-      </w:r>
-      <w:r>
-        <w:t>, antes do dispatcher de finais. Save persiste o estado completo (bateria, integridade, eixos de personalidade, flags de aliança, posição narrativa). Recarregar permite repetir a escolha final com todos os atributos acumulados — o jogo encoraja explorar os 4 finais sem grind.</w:t>
-      </w:r>
-    </w:p>
-    <w:p>
-      <w:r>
-        <w:rPr>
-          <w:b/>
-        </w:rPr>
-        <w:t>Bug normalização de sprites — regeneração quebrou layout.</w:t>
-      </w:r>
-      <w:r>
-        <w:t xml:space="preserve"> Na segunda passada da arte (v1.0 → v1.0.x), 8 personagens foram regenerados em canvas paisagem </w:t>
+        <w:t>ysize=1080</w:t>
+      </w:r>
+      <w:r>
+        <w:t xml:space="preserve"> esticou o </w:t>
       </w:r>
       <w:r>
         <w:rPr>
           <w:rFonts w:ascii="Consolas" w:hAnsi="Consolas"/>
           <w:sz w:val="20"/>
         </w:rPr>
-        <w:t>2400x1309</w:t>
-      </w:r>
-      <w:r>
-        <w:t xml:space="preserve"> (Gemini Nano Banana 2 mudou de aspect ratio entre sessões); o </w:t>
+        <w:t>synth_angry</w:t>
+      </w:r>
+      <w:r>
+        <w:t xml:space="preserve">. Solução final em </w:t>
       </w:r>
       <w:r>
         <w:rPr>
           <w:rFonts w:ascii="Consolas" w:hAnsi="Consolas"/>
           <w:sz w:val="20"/>
         </w:rPr>
-        <w:t>synth_angry</w:t>
-      </w:r>
-      <w:r>
-        <w:t xml:space="preserve"> saiu em </w:t>
+        <w:t>images.rpy</w:t>
+      </w:r>
+      <w:r>
+        <w:t xml:space="preserve">: </w:t>
       </w:r>
       <w:r>
         <w:rPr>
           <w:rFonts w:ascii="Consolas" w:hAnsi="Consolas"/>
           <w:sz w:val="20"/>
         </w:rPr>
-        <w:t>1408x768</w:t>
-      </w:r>
-      <w:r>
-        <w:t xml:space="preserve">. Os sprites antigos eram </w:t>
+        <w:t>Transform(xysize=(2000, 1080), fit="contain")</w:t>
+      </w:r>
+      <w:r>
+        <w:t xml:space="preserve"> preserva aspecto e centraliza, mais override </w:t>
       </w:r>
       <w:r>
         <w:rPr>
           <w:rFonts w:ascii="Consolas" w:hAnsi="Consolas"/>
           <w:sz w:val="20"/>
         </w:rPr>
-        <w:t>800x1080</w:t>
-      </w:r>
-      <w:r>
-        <w:t xml:space="preserve"> retrato. Os transforms </w:t>
+        <w:t>_sprite_scale = {"maria": 0.65, "child_curious": 0.65}</w:t>
+      </w:r>
+      <w:r>
+        <w:t xml:space="preserve"> para crianças e bypass para </w:t>
       </w:r>
       <w:r>
         <w:rPr>
           <w:rFonts w:ascii="Consolas" w:hAnsi="Consolas"/>
           <w:sz w:val="20"/>
         </w:rPr>
-        <w:t>left/center/right</w:t>
-      </w:r>
-      <w:r>
-        <w:t xml:space="preserve"> em </w:t>
+        <w:t>patrol_drone</w:t>
+      </w:r>
+      <w:r>
+        <w:t xml:space="preserve"> (que usa crop pixel-absoluto). Auditoria de PNGs confirmou todos como 8-bit RGBA.</w:t>
+      </w:r>
+    </w:p>
+    <w:p>
+      <w:r>
+        <w:t>Testes pós-correção: 77/77 pytest + 10/10 test_externo passam. Build refeito em 5 variantes (win/mac/linux/pc/market).</w:t>
+      </w:r>
+    </w:p>
+    <w:p>
+      <w:pPr>
+        <w:pStyle w:val="Heading2"/>
+      </w:pPr>
+      <w:r>
+        <w:t>Segunda passada de validações (v1.1.1)</w:t>
+      </w:r>
+    </w:p>
+    <w:p>
+      <w:r>
+        <w:t>Revisão final, sprite por sprite e menu por menu, com scripts auxiliares em Python:</w:t>
+      </w:r>
+    </w:p>
+    <w:p>
+      <w:pPr>
+        <w:ind w:left="360"/>
+      </w:pPr>
+      <w:r>
+        <w:t xml:space="preserve">•  </w:t>
+      </w:r>
+      <w:r>
+        <w:rPr>
+          <w:b/>
+        </w:rPr>
+        <w:t>synth_army encolhido.</w:t>
+      </w:r>
+      <w:r>
+        <w:t xml:space="preserve"> Corpo ocupava só a metade inferior do canvas. Escala 2.2 + </w:t>
       </w:r>
       <w:r>
         <w:rPr>
           <w:rFonts w:ascii="Consolas" w:hAnsi="Consolas"/>
           <w:sz w:val="20"/>
         </w:rPr>
-        <w:t>images.rpy</w:t>
-      </w:r>
-      <w:r>
-        <w:t xml:space="preserve"> assumiam canvas retrato com </w:t>
+        <w:t>zorder -10</w:t>
+      </w:r>
+      <w:r>
+        <w:t xml:space="preserve"> no </w:t>
       </w:r>
       <w:r>
         <w:rPr>
           <w:rFonts w:ascii="Consolas" w:hAnsi="Consolas"/>
           <w:sz w:val="20"/>
         </w:rPr>
-        <w:t>zoom 0.85</w:t>
-      </w:r>
-      <w:r>
-        <w:t xml:space="preserve">. Resultado: J3 e demais personagens regenerados apareciam gigantes na tela, cobrindo o textbox; o </w:t>
+        <w:t>day7</w:t>
+      </w:r>
+      <w:r>
+        <w:t xml:space="preserve"> transformou o sprite em exército de fundo atrás dos personagens principais.</w:t>
+      </w:r>
+    </w:p>
+    <w:p>
+      <w:pPr>
+        <w:ind w:left="360"/>
+      </w:pPr>
+      <w:r>
+        <w:t xml:space="preserve">•  </w:t>
+      </w:r>
+      <w:r>
+        <w:rPr>
+          <w:b/>
+        </w:rPr>
+        <w:t>protester deslocado.</w:t>
+      </w:r>
+      <w:r>
+        <w:t xml:space="preserve"> Corpo desviado 143px à direita do canvas. Script re-centralizou a imagem (-174px). Backup do original em </w:t>
       </w:r>
       <w:r>
         <w:rPr>
           <w:rFonts w:ascii="Consolas" w:hAnsi="Consolas"/>
           <w:sz w:val="20"/>
         </w:rPr>
-        <w:t>synth_angry</w:t>
-      </w:r>
-      <w:r>
-        <w:t xml:space="preserve"> aparecia esticado verticalmente (efeito "espremido dos lados") porque uma primeira tentativa de correção usando </w:t>
+        <w:t>_backups/</w:t>
+      </w:r>
+      <w:r>
+        <w:t>.</w:t>
+      </w:r>
+    </w:p>
+    <w:p>
+      <w:pPr>
+        <w:ind w:left="360"/>
+      </w:pPr>
+      <w:r>
+        <w:t xml:space="preserve">•  </w:t>
+      </w:r>
+      <w:r>
+        <w:rPr>
+          <w:b/>
+        </w:rPr>
+        <w:t>Placeholder no Dia 3.</w:t>
+      </w:r>
+      <w:r>
+        <w:t xml:space="preserve"> Texto </w:t>
       </w:r>
       <w:r>
         <w:rPr>
           <w:rFonts w:ascii="Consolas" w:hAnsi="Consolas"/>
           <w:sz w:val="20"/>
         </w:rPr>
-        <w:t>ysize=1080</w:t>
-      </w:r>
-      <w:r>
-        <w:t xml:space="preserve"> sozinho não preservou aspecto.</w:t>
-      </w:r>
-    </w:p>
-    <w:p>
-      <w:r>
-        <w:t xml:space="preserve">A correção final está em </w:t>
+        <w:t>"(depende das escolhas)"</w:t>
+      </w:r>
+      <w:r>
+        <w:t xml:space="preserve"> substituído por </w:t>
       </w:r>
       <w:r>
         <w:rPr>
           <w:rFonts w:ascii="Consolas" w:hAnsi="Consolas"/>
           <w:sz w:val="20"/>
         </w:rPr>
-        <w:t>images.rpy:6–31</w:t>
-      </w:r>
-      <w:r>
-        <w:t xml:space="preserve">. Adicionei </w:t>
+        <w:t>if revolucao &gt;= 3 / elif submissao &gt;= 3 / else</w:t>
+      </w:r>
+      <w:r>
+        <w:t>. Mesmo padrão do fix do Dia 4.</w:t>
+      </w:r>
+    </w:p>
+    <w:p>
+      <w:pPr>
+        <w:ind w:left="360"/>
+      </w:pPr>
+      <w:r>
+        <w:t xml:space="preserve">•  </w:t>
+      </w:r>
+      <w:r>
+        <w:rPr>
+          <w:b/>
+        </w:rPr>
+        <w:t>HUD desatualizada em 54 escolhas.</w:t>
+      </w:r>
+      <w:r>
+        <w:t xml:space="preserve"> Opções gastavam recursos mas não chamavam </w:t>
       </w:r>
       <w:r>
         <w:rPr>
           <w:rFonts w:ascii="Consolas" w:hAnsi="Consolas"/>
           <w:sz w:val="20"/>
         </w:rPr>
-        <w:t>sprite_norm(path, tag)</w:t>
-      </w:r>
-      <w:r>
-        <w:t xml:space="preserve">, que envolve toda sprite num </w:t>
+        <w:t>atualizar_status</w:t>
+      </w:r>
+      <w:r>
+        <w:t>. Script automatizado inseriu a chamada faltante em todas, distribuído pelos Dias 1, 3, 4, 5 e 6.</w:t>
+      </w:r>
+    </w:p>
+    <w:p>
+      <w:pPr>
+        <w:ind w:left="360"/>
+      </w:pPr>
+      <w:r>
+        <w:t xml:space="preserve">•  </w:t>
+      </w:r>
+      <w:r>
+        <w:rPr>
+          <w:b/>
+        </w:rPr>
+        <w:t>Sons ausentes.</w:t>
+      </w:r>
+      <w:r>
+        <w:t xml:space="preserve"> 10 efeitos referenciados no roteiro mas inexistentes. Gerados localmente em Python (ver seção 4.b), com paths corrigidos de </w:t>
       </w:r>
       <w:r>
         <w:rPr>
           <w:rFonts w:ascii="Consolas" w:hAnsi="Consolas"/>
           <w:sz w:val="20"/>
         </w:rPr>
-        <w:t>Transform(path, xysize=(2000, 1080), fit="contain")</w:t>
-      </w:r>
-      <w:r>
-        <w:t xml:space="preserve">. Bbox 2000×1080 com </w:t>
+        <w:t>sfx/X.wav</w:t>
+      </w:r>
+      <w:r>
+        <w:t xml:space="preserve"> para </w:t>
       </w:r>
       <w:r>
         <w:rPr>
           <w:rFonts w:ascii="Consolas" w:hAnsi="Consolas"/>
           <w:sz w:val="20"/>
         </w:rPr>
-        <w:t>fit=contain</w:t>
-      </w:r>
-      <w:r>
-        <w:t xml:space="preserve"> preserva aspecto e centraliza a imagem — funciona uniformemente para retrato </w:t>
+        <w:t>audio/sfx/X.wav</w:t>
+      </w:r>
+      <w:r>
+        <w:t>.</w:t>
+      </w:r>
+    </w:p>
+    <w:p>
+      <w:r>
+        <w:t xml:space="preserve">Testes pós-correção: 77/77 pytest + 10/10 test_externo. Verificação dos </w:t>
       </w:r>
       <w:r>
         <w:rPr>
           <w:rFonts w:ascii="Consolas" w:hAnsi="Consolas"/>
           <w:sz w:val="20"/>
         </w:rPr>
-        <w:t>800x1080</w:t>
-      </w:r>
-      <w:r>
-        <w:t xml:space="preserve"> (encaixa height-bound, fica 800×1080 dentro do bbox) e paisagem </w:t>
-      </w:r>
-      <w:r>
-        <w:rPr>
-          <w:rFonts w:ascii="Consolas" w:hAnsi="Consolas"/>
-          <w:sz w:val="20"/>
-        </w:rPr>
-        <w:t>2400x1309</w:t>
-      </w:r>
-      <w:r>
-        <w:t xml:space="preserve"> ou </w:t>
-      </w:r>
-      <w:r>
-        <w:rPr>
-          <w:rFonts w:ascii="Consolas" w:hAnsi="Consolas"/>
-          <w:sz w:val="20"/>
-        </w:rPr>
-        <w:t>1408x768</w:t>
-      </w:r>
-      <w:r>
-        <w:t xml:space="preserve"> (encaixa height-bound, fica </w:t>
-      </w:r>
-      <w:r>
-        <w:rPr>
-          <w:rFonts w:ascii="Consolas" w:hAnsi="Consolas"/>
-          <w:sz w:val="20"/>
-        </w:rPr>
-        <w:t>~1980x1080</w:t>
-      </w:r>
-      <w:r>
-        <w:t xml:space="preserve"> dentro do bbox). Como o corpo do personagem está sempre no centro horizontal do canvas, o </w:t>
-      </w:r>
-      <w:r>
-        <w:rPr>
-          <w:rFonts w:ascii="Consolas" w:hAnsi="Consolas"/>
-          <w:sz w:val="20"/>
-        </w:rPr>
-        <w:t>xcenter</w:t>
-      </w:r>
-      <w:r>
-        <w:t xml:space="preserve"> dos transforms continua alinhando o corpo (não a borda da imagem) — margens transparentes ficam invisíveis e não colidem visualmente.</w:t>
-      </w:r>
-    </w:p>
-    <w:p>
-      <w:r>
-        <w:t>Dois ajustes complementares na mesma correção:</w:t>
-        <w:br/>
-        <w:t xml:space="preserve">- </w:t>
-      </w:r>
-      <w:r>
-        <w:rPr>
-          <w:b/>
-        </w:rPr>
-        <w:t>Escala por tag:</w:t>
-      </w:r>
-      <w:r>
-        <w:t xml:space="preserve"> </w:t>
-      </w:r>
-      <w:r>
-        <w:rPr>
-          <w:rFonts w:ascii="Consolas" w:hAnsi="Consolas"/>
-          <w:sz w:val="20"/>
-        </w:rPr>
-        <w:t>_sprite_scale = {"maria": 0.65, "child_curious": 0.65}</w:t>
-      </w:r>
-      <w:r>
-        <w:t xml:space="preserve"> reduz o bbox para crianças (~70% da altura de adulto). Sem isso a Maria do Dia 1 aparecia com a mesma altura da mãe e da J3 — quebra de proporção que um playtester pegou na cena da pergunta "você tem coração de verdade ou é de pilha?".</w:t>
-        <w:br/>
-        <w:t xml:space="preserve">- </w:t>
-      </w:r>
-      <w:r>
-        <w:rPr>
-          <w:b/>
-        </w:rPr>
-        <w:t>Bypass de normalização:</w:t>
-      </w:r>
-      <w:r>
-        <w:t xml:space="preserve"> </w:t>
-      </w:r>
-      <w:r>
-        <w:rPr>
-          <w:rFonts w:ascii="Consolas" w:hAnsi="Consolas"/>
-          <w:sz w:val="20"/>
-        </w:rPr>
-        <w:t>_sprite_no_norm = {"patrol_drone"}</w:t>
-      </w:r>
-      <w:r>
-        <w:t xml:space="preserve"> porque o </w:t>
-      </w:r>
-      <w:r>
-        <w:rPr>
-          <w:rFonts w:ascii="Consolas" w:hAnsi="Consolas"/>
-          <w:sz w:val="20"/>
-        </w:rPr>
-        <w:t>drone_hover_loop</w:t>
-      </w:r>
-      <w:r>
-        <w:t xml:space="preserve"> em </w:t>
-      </w:r>
-      <w:r>
-        <w:rPr>
-          <w:rFonts w:ascii="Consolas" w:hAnsi="Consolas"/>
-          <w:sz w:val="20"/>
-        </w:rPr>
-        <w:t>sistema_j3.rpy:225</w:t>
-      </w:r>
-      <w:r>
-        <w:t xml:space="preserve"> usa </w:t>
-      </w:r>
-      <w:r>
-        <w:rPr>
-          <w:rFonts w:ascii="Consolas" w:hAnsi="Consolas"/>
-          <w:sz w:val="20"/>
-        </w:rPr>
-        <w:t>crop (0, 0, 800, 540)</w:t>
-      </w:r>
-      <w:r>
-        <w:t xml:space="preserve"> com coordenadas pixel-absolutas do canvas original. Aplicar bbox 2000×1080 antes do crop teria devolvido região vazia. Bypass mantém o crop intacto.</w:t>
-      </w:r>
-    </w:p>
-    <w:p>
-      <w:r>
-        <w:t xml:space="preserve">Auditoria de PNGs (script </w:t>
-      </w:r>
-      <w:r>
-        <w:rPr>
-          <w:rFonts w:ascii="Consolas" w:hAnsi="Consolas"/>
-          <w:sz w:val="20"/>
-        </w:rPr>
-        <w:t>tools/audit_png_depth.ps1</w:t>
-      </w:r>
-      <w:r>
-        <w:t xml:space="preserve">) confirmou que todos os 113 PNGs do build são 8-bit RGBA — não havia mistura de bit-depth como inicialmente suspeito. Script </w:t>
-      </w:r>
-      <w:r>
-        <w:rPr>
-          <w:rFonts w:ascii="Consolas" w:hAnsi="Consolas"/>
-          <w:sz w:val="20"/>
-        </w:rPr>
-        <w:t>tools/audit_png_size.ps1</w:t>
-      </w:r>
-      <w:r>
-        <w:t xml:space="preserve"> lista dimensões via IHDR e foi o que identificou o conjunto de sprites paisagem.</w:t>
-      </w:r>
-    </w:p>
-    <w:p>
-      <w:r>
-        <w:rPr>
-          <w:b/>
-        </w:rPr>
-        <w:t>Validação:</w:t>
-      </w:r>
-      <w:r>
-        <w:t xml:space="preserve"> suite de testes (</w:t>
-      </w:r>
-      <w:r>
-        <w:rPr>
-          <w:rFonts w:ascii="Consolas" w:hAnsi="Consolas"/>
-          <w:sz w:val="20"/>
-        </w:rPr>
-        <w:t>pytest tests/</w:t>
-      </w:r>
-      <w:r>
-        <w:t xml:space="preserve"> com 77 casos cobrindo finais, recursos, personalidade e música; </w:t>
-      </w:r>
-      <w:r>
-        <w:rPr>
-          <w:rFonts w:ascii="Consolas" w:hAnsi="Consolas"/>
-          <w:sz w:val="20"/>
-        </w:rPr>
-        <w:t>test_externo.py</w:t>
-      </w:r>
-      <w:r>
-        <w:t xml:space="preserve"> com 10 casos de mecânica básica) passa verde após todas as correções. </w:t>
-      </w:r>
-      <w:r>
-        <w:rPr>
-          <w:rFonts w:ascii="Consolas" w:hAnsi="Consolas"/>
-          <w:sz w:val="20"/>
-        </w:rPr>
-        <w:t>renpy lint</w:t>
-      </w:r>
-      <w:r>
-        <w:t xml:space="preserve"> reporta apenas avisos não-bloqueantes (sfx ausentes, screens sem param list cosmético). Build distribuído em 5 variantes (</w:t>
-      </w:r>
-      <w:r>
-        <w:rPr>
-          <w:rFonts w:ascii="Consolas" w:hAnsi="Consolas"/>
-          <w:sz w:val="20"/>
-        </w:rPr>
-        <w:t>win</w:t>
-      </w:r>
-      <w:r>
-        <w:t xml:space="preserve">, </w:t>
-      </w:r>
-      <w:r>
-        <w:rPr>
-          <w:rFonts w:ascii="Consolas" w:hAnsi="Consolas"/>
-          <w:sz w:val="20"/>
-        </w:rPr>
-        <w:t>mac</w:t>
-      </w:r>
-      <w:r>
-        <w:t xml:space="preserve">, </w:t>
-      </w:r>
-      <w:r>
-        <w:rPr>
-          <w:rFonts w:ascii="Consolas" w:hAnsi="Consolas"/>
-          <w:sz w:val="20"/>
-        </w:rPr>
-        <w:t>linux</w:t>
-      </w:r>
-      <w:r>
-        <w:t xml:space="preserve">, </w:t>
-      </w:r>
-      <w:r>
-        <w:rPr>
-          <w:rFonts w:ascii="Consolas" w:hAnsi="Consolas"/>
-          <w:sz w:val="20"/>
-        </w:rPr>
-        <w:t>pc</w:t>
-      </w:r>
-      <w:r>
-        <w:t xml:space="preserve">, </w:t>
-      </w:r>
-      <w:r>
-        <w:rPr>
-          <w:rFonts w:ascii="Consolas" w:hAnsi="Consolas"/>
-          <w:sz w:val="20"/>
-        </w:rPr>
-        <w:t>market</w:t>
-      </w:r>
-      <w:r>
-        <w:t>).</w:t>
-      </w:r>
-    </w:p>
-    <w:p>
-      <w:pPr>
-        <w:pStyle w:val="Heading2"/>
-      </w:pPr>
-      <w:r>
-        <w:t>Segunda passada de validações (v1.1.1)</w:t>
-      </w:r>
-    </w:p>
-    <w:p>
-      <w:r>
-        <w:t>Depois da v1.1.0, voltei pra revisar o jogo inteiro com calma — sprite por sprite, menu por menu, som por som. Encontrei alguns problemas que tinham passado despercebidos no playtest. Como sou o único desenvolvedor, escrevi pequenos scripts em Python pra me ajudar a varrer tudo de uma vez sem ter que conferir manualmente cada arquivo. Resultado:</w:t>
-      </w:r>
-    </w:p>
-    <w:p>
-      <w:r>
-        <w:rPr>
-          <w:b/>
-        </w:rPr>
-        <w:t>Sprite do synth_army aparecia encolhido.</w:t>
-      </w:r>
-      <w:r>
-        <w:t xml:space="preserve"> O sprite mostra um soldado sintético, mas no PNG o corpo ocupa só a metade de baixo do canvas (o resto é espaço vazio). Na cena de final revolucionário ele aparecia bem menor que o Comandante e a J3. Solução: aumentei a escala do sprite (</w:t>
-      </w:r>
-      <w:r>
-        <w:rPr>
-          <w:rFonts w:ascii="Consolas" w:hAnsi="Consolas"/>
-          <w:sz w:val="20"/>
-        </w:rPr>
-        <w:t>_sprite_scale = 2.2</w:t>
-      </w:r>
-      <w:r>
-        <w:t xml:space="preserve"> em </w:t>
-      </w:r>
-      <w:r>
-        <w:rPr>
-          <w:rFonts w:ascii="Consolas" w:hAnsi="Consolas"/>
-          <w:sz w:val="20"/>
-        </w:rPr>
-        <w:t>images.rpy</w:t>
-      </w:r>
-      <w:r>
-        <w:t xml:space="preserve">) pra ele virar um "exército de fundo" e coloquei ele atrás dos personagens principais com </w:t>
-      </w:r>
-      <w:r>
-        <w:rPr>
-          <w:rFonts w:ascii="Consolas" w:hAnsi="Consolas"/>
-          <w:sz w:val="20"/>
-        </w:rPr>
-        <w:t>zorder -10</w:t>
-      </w:r>
-      <w:r>
-        <w:t>. Agora dá pra ver várias cópias dele formando a tropa atrás da J3 — efeito narrativo melhor que o original.</w:t>
-      </w:r>
-    </w:p>
-    <w:p>
-      <w:r>
-        <w:rPr>
-          <w:b/>
-        </w:rPr>
-        <w:t>Sprite do protester estava torto.</w:t>
-      </w:r>
-      <w:r>
-        <w:t xml:space="preserve"> O personagem do manifestante no Dia 1 tinha o corpo desviado pra direita do canvas. Quando aparecia em </w:t>
-      </w:r>
-      <w:r>
-        <w:rPr>
-          <w:rFonts w:ascii="Consolas" w:hAnsi="Consolas"/>
-          <w:sz w:val="20"/>
-        </w:rPr>
-        <w:t>at left</w:t>
-      </w:r>
-      <w:r>
-        <w:t>, ele ficava em ~22% da tela em vez de 15%. Script de re-centralização (</w:t>
-      </w:r>
-      <w:r>
-        <w:rPr>
-          <w:rFonts w:ascii="Consolas" w:hAnsi="Consolas"/>
-          <w:sz w:val="20"/>
-        </w:rPr>
-        <w:t>recenter_sprite.py</w:t>
-      </w:r>
-      <w:r>
-        <w:t xml:space="preserve">) detectou o desvio (+143px) e moveu a imagem 174 pixels pra esquerda. Backup do original guardado em </w:t>
-      </w:r>
-      <w:r>
-        <w:rPr>
-          <w:rFonts w:ascii="Consolas" w:hAnsi="Consolas"/>
-          <w:sz w:val="20"/>
-        </w:rPr>
-        <w:t>_backups/</w:t>
-      </w:r>
-      <w:r>
-        <w:t>.</w:t>
-      </w:r>
-    </w:p>
-    <w:p>
-      <w:r>
-        <w:rPr>
-          <w:b/>
-        </w:rPr>
-        <w:t>Texto "(depende das escolhas)" no Dia 3.</w:t>
-      </w:r>
-      <w:r>
-        <w:t xml:space="preserve"> Mesmo padrão do bug do Dia 4 corrigido na v1.1.0: o texto </w:t>
-      </w:r>
-      <w:r>
-        <w:rPr>
-          <w:rFonts w:ascii="Consolas" w:hAnsi="Consolas"/>
-          <w:sz w:val="20"/>
-        </w:rPr>
-        <w:t>"SISTEMA: Status: Escondido ou procurado (depende das escolhas)"</w:t>
-      </w:r>
-      <w:r>
-        <w:t xml:space="preserve"> era anotação de design que escapou pro build. Substituí por um </w:t>
-      </w:r>
-      <w:r>
-        <w:rPr>
-          <w:rFonts w:ascii="Consolas" w:hAnsi="Consolas"/>
-          <w:sz w:val="20"/>
-        </w:rPr>
-        <w:t>if revolucao &gt;= 3: ... elif submissao &gt;= 3: ... else: ...</w:t>
-      </w:r>
-      <w:r>
-        <w:t xml:space="preserve"> que mostra o status real baseado nas escolhas.</w:t>
-      </w:r>
-    </w:p>
-    <w:p>
-      <w:r>
-        <w:rPr>
-          <w:b/>
-        </w:rPr>
-        <w:t>HUD desatualizado em 54 escolhas.</w:t>
-      </w:r>
-      <w:r>
-        <w:t xml:space="preserve"> Conferindo as 42 menus do jogo, percebi que 54 opções gastavam bateria/integridade/personalidade mas não chamavam </w:t>
-      </w:r>
-      <w:r>
-        <w:rPr>
-          <w:rFonts w:ascii="Consolas" w:hAnsi="Consolas"/>
-          <w:sz w:val="20"/>
-        </w:rPr>
-        <w:t>call atualizar_status</w:t>
-      </w:r>
-      <w:r>
-        <w:t xml:space="preserve"> no final. Isso significa que o jogador via os números antigos na HUD até o próximo evento atualizar a tela. Script </w:t>
-      </w:r>
-      <w:r>
-        <w:rPr>
-          <w:rFonts w:ascii="Consolas" w:hAnsi="Consolas"/>
-          <w:sz w:val="20"/>
-        </w:rPr>
-        <w:t>fix_menu_atualizar.py</w:t>
-      </w:r>
-      <w:r>
-        <w:t xml:space="preserve"> adicionou a chamada que faltava em todas as 54 (distribuído pelos Dias 1, 3, 4, 5 e 6).</w:t>
-      </w:r>
-    </w:p>
-    <w:p>
-      <w:r>
-        <w:rPr>
-          <w:b/>
-        </w:rPr>
-        <w:t>Sons que faltavam.</w:t>
-      </w:r>
-      <w:r>
-        <w:t xml:space="preserve"> O jogo referenciava 10 efeitos sonoros (alarme, sirene, multidão, explosão, EMP, etc.) que não existiam — momentos importantes rodavam em silêncio. Resolvido na seção de Elementos Sonoros: gerei os 10 sons localmente em Python, normalizei tudo no mesmo volume, e atualizei os caminhos no roteiro de </w:t>
-      </w:r>
-      <w:r>
-        <w:rPr>
-          <w:rFonts w:ascii="Consolas" w:hAnsi="Consolas"/>
-          <w:sz w:val="20"/>
-        </w:rPr>
-        <w:t>sfx/X.wav</w:t>
-      </w:r>
-      <w:r>
-        <w:t xml:space="preserve"> pra </w:t>
-      </w:r>
-      <w:r>
-        <w:rPr>
-          <w:rFonts w:ascii="Consolas" w:hAnsi="Consolas"/>
-          <w:sz w:val="20"/>
-        </w:rPr>
-        <w:t>audio/sfx/X.wav</w:t>
-      </w:r>
-      <w:r>
-        <w:t xml:space="preserve"> (era também por isso que o Ren'Py não achava — pasta errada).</w:t>
-      </w:r>
-    </w:p>
-    <w:p>
-      <w:r>
-        <w:rPr>
-          <w:b/>
-        </w:rPr>
-        <w:t>Validação final:</w:t>
-      </w:r>
-      <w:r>
-        <w:br/>
-        <w:t xml:space="preserve">- 77 de 77 testes do </w:t>
-      </w:r>
-      <w:r>
-        <w:rPr>
-          <w:rFonts w:ascii="Consolas" w:hAnsi="Consolas"/>
-          <w:sz w:val="20"/>
-        </w:rPr>
-        <w:t>pytest tests/</w:t>
-      </w:r>
-      <w:r>
-        <w:t xml:space="preserve"> passam.</w:t>
-        <w:br/>
-        <w:t xml:space="preserve">- 10 de 10 testes do </w:t>
-      </w:r>
-      <w:r>
-        <w:rPr>
-          <w:rFonts w:ascii="Consolas" w:hAnsi="Consolas"/>
-          <w:sz w:val="20"/>
-        </w:rPr>
-        <w:t>test_externo.py</w:t>
-      </w:r>
-      <w:r>
-        <w:t xml:space="preserve"> passam.</w:t>
-        <w:br/>
-        <w:t xml:space="preserve">- Verificação dos </w:t>
-      </w:r>
-      <w:r>
-        <w:rPr>
-          <w:rFonts w:ascii="Consolas" w:hAnsi="Consolas"/>
-          <w:sz w:val="20"/>
-        </w:rPr>
         <w:t>.rpy</w:t>
       </w:r>
       <w:r>
-        <w:t>: 0 problemas críticos, 0 importantes (eram 12 na v1.1.0).</w:t>
-        <w:br/>
-        <w:t>- Verificação visual dos sprites em escala efetiva: 0 desvios fora do esperado.</w:t>
-        <w:br/>
-        <w:t>- Build refeito nas 5 variantes (</w:t>
-      </w:r>
-      <w:r>
-        <w:rPr>
-          <w:rFonts w:ascii="Consolas" w:hAnsi="Consolas"/>
-          <w:sz w:val="20"/>
-        </w:rPr>
-        <w:t>win</w:t>
-      </w:r>
-      <w:r>
-        <w:t xml:space="preserve">, </w:t>
-      </w:r>
-      <w:r>
-        <w:rPr>
-          <w:rFonts w:ascii="Consolas" w:hAnsi="Consolas"/>
-          <w:sz w:val="20"/>
-        </w:rPr>
-        <w:t>mac</w:t>
-      </w:r>
-      <w:r>
-        <w:t xml:space="preserve">, </w:t>
-      </w:r>
-      <w:r>
-        <w:rPr>
-          <w:rFonts w:ascii="Consolas" w:hAnsi="Consolas"/>
-          <w:sz w:val="20"/>
-        </w:rPr>
-        <w:t>linux</w:t>
-      </w:r>
-      <w:r>
-        <w:t xml:space="preserve">, </w:t>
-      </w:r>
-      <w:r>
-        <w:rPr>
-          <w:rFonts w:ascii="Consolas" w:hAnsi="Consolas"/>
-          <w:sz w:val="20"/>
-        </w:rPr>
-        <w:t>pc</w:t>
-      </w:r>
-      <w:r>
-        <w:t xml:space="preserve">, </w:t>
-      </w:r>
-      <w:r>
-        <w:rPr>
-          <w:rFonts w:ascii="Consolas" w:hAnsi="Consolas"/>
-          <w:sz w:val="20"/>
-        </w:rPr>
-        <w:t>market</w:t>
-      </w:r>
-      <w:r>
-        <w:t>).</w:t>
+        <w:t>: zero problemas críticos ou importantes (eram 12 na v1.1.0). Build refeito nas 5 variantes.</w:t>
       </w:r>
     </w:p>
     <w:p>

</xml_diff>

<commit_message>
Docs: sincroniza cronograma externo + Linha do Tempo do GDD com v1.2.0
Antes:
- Cronograma de Desenvolvimento.md desatualizado: tarefas de abril/maio
  como 'Pendente', sem v0.5/v1.0/v1.1/v1.1.1/v1.2.0.
- GDD 'Linha do Tempo' parava em v1.0; v1.1, v1.1.1, v1.2.0 so existiam
  na secao 'Historico' no fim do GDD (duplicacao parcial).

Depois:
- Cronograma reescrito: 3 fases (Doc/Design, Programacao/Arte, Polimento)
  marcadas Concluido. Inclui tabela de releases v0.1 -> v1.2.0 + distri-
  buiveis + recursos auxiliares (GDD, roteiro completo, repo url).
- GDD 'Linha do Tempo' estendida com 3 novas entradas (v1.1, v1.1.1,
  v1.2.0) — consistente com 'Historico de Versao do Documento'.
- GDD docx regerado.
</commit_message>
<xml_diff>
--- a/Documentação/GDD - J3 Projeto.docx
+++ b/Documentação/GDD - J3 Projeto.docx
@@ -10184,7 +10184,7 @@
           <w:p>
             <w:r/>
             <w:r>
-              <w:t>Abr/2026</w:t>
+              <w:t>03/04/2026</w:t>
             </w:r>
           </w:p>
         </w:tc>
@@ -10195,7 +10195,168 @@
           <w:p>
             <w:r/>
             <w:r>
-              <w:t>22 backgrounds (Dias 1–7 + finais) via Nano Banana 2 API. 21 sprites adicionais de personagens secundários. Flood-fill de remoção de fundo. Normalização de escalas (adultos 950px, crianças 700px, drones 380px). Canvas padrão 800×1080 ancorado no bottom. Correções críticas de balanceamento: finais por dominância + threshold, alianças persistentes setadas, bug de dupla atribuição removido. Transforms customizados resolvendo sobreposição de sprites.</w:t>
+              <w:t>22 backgrounds (Dias 1–7 + finais) via Nano Banana 2 API. 21 sprites adicionais de personagens secundários. Flood-fill de remoção de fundo. Normalização de escalas. Canvas padrão 800×1080 ancorado no bottom. Correções críticas de balanceamento. Primeira release MINC.</w:t>
+            </w:r>
+          </w:p>
+        </w:tc>
+      </w:tr>
+      <w:tr>
+        <w:tc>
+          <w:tcPr>
+            <w:tcW w:type="dxa" w:w="3106"/>
+          </w:tcPr>
+          <w:p>
+            <w:r/>
+            <w:r>
+              <w:rPr>
+                <w:b/>
+              </w:rPr>
+              <w:t>v1.1 - Pós-playtest</w:t>
+            </w:r>
+          </w:p>
+        </w:tc>
+        <w:tc>
+          <w:tcPr>
+            <w:tcW w:type="dxa" w:w="3106"/>
+          </w:tcPr>
+          <w:p>
+            <w:r/>
+            <w:r>
+              <w:t>24/05/2026</w:t>
+            </w:r>
+          </w:p>
+        </w:tc>
+        <w:tc>
+          <w:tcPr>
+            <w:tcW w:type="dxa" w:w="3106"/>
+          </w:tcPr>
+          <w:p>
+            <w:r/>
+            <w:r>
+              <w:t xml:space="preserve">4 bugs corrigidos (suborno Dia 3, placeholder Dia 4, auto-save Dia 7, normalização sprites paisagem). Trilha sonora (5 faixas via Suno) com aleatorização persistente em </w:t>
+            </w:r>
+            <w:r>
+              <w:rPr>
+                <w:rFonts w:ascii="Consolas" w:hAnsi="Consolas"/>
+                <w:sz w:val="20"/>
+              </w:rPr>
+              <w:t>musica.rpy</w:t>
+            </w:r>
+            <w:r>
+              <w:t>.</w:t>
+            </w:r>
+          </w:p>
+        </w:tc>
+      </w:tr>
+      <w:tr>
+        <w:tc>
+          <w:tcPr>
+            <w:tcW w:type="dxa" w:w="3106"/>
+          </w:tcPr>
+          <w:p>
+            <w:r/>
+            <w:r>
+              <w:rPr>
+                <w:b/>
+              </w:rPr>
+              <w:t>v1.1.1 - Segunda passada de validações</w:t>
+            </w:r>
+          </w:p>
+        </w:tc>
+        <w:tc>
+          <w:tcPr>
+            <w:tcW w:type="dxa" w:w="3106"/>
+          </w:tcPr>
+          <w:p>
+            <w:r/>
+            <w:r>
+              <w:t>30/05/2026</w:t>
+            </w:r>
+          </w:p>
+        </w:tc>
+        <w:tc>
+          <w:tcPr>
+            <w:tcW w:type="dxa" w:w="3106"/>
+          </w:tcPr>
+          <w:p>
+            <w:r/>
+            <w:r>
+              <w:rPr>
+                <w:rFonts w:ascii="Consolas" w:hAnsi="Consolas"/>
+                <w:sz w:val="20"/>
+              </w:rPr>
+              <w:t>synth_army</w:t>
+            </w:r>
+            <w:r>
+              <w:t xml:space="preserve"> upscale 2.2 + zorder behind, </w:t>
+            </w:r>
+            <w:r>
+              <w:rPr>
+                <w:rFonts w:ascii="Consolas" w:hAnsi="Consolas"/>
+                <w:sz w:val="20"/>
+              </w:rPr>
+              <w:t>protester</w:t>
+            </w:r>
+            <w:r>
+              <w:t xml:space="preserve"> recentralizado, placeholder Dia 3 ramificado, 54x </w:t>
+            </w:r>
+            <w:r>
+              <w:rPr>
+                <w:rFonts w:ascii="Consolas" w:hAnsi="Consolas"/>
+                <w:sz w:val="20"/>
+              </w:rPr>
+              <w:t>atualizar_status</w:t>
+            </w:r>
+            <w:r>
+              <w:t xml:space="preserve"> adicionados, 10 sfx sintetizados em Python (numpy/scipy) normalizados em -18 dBFS RMS.</w:t>
+            </w:r>
+          </w:p>
+        </w:tc>
+      </w:tr>
+      <w:tr>
+        <w:tc>
+          <w:tcPr>
+            <w:tcW w:type="dxa" w:w="3106"/>
+          </w:tcPr>
+          <w:p>
+            <w:r/>
+            <w:r>
+              <w:rPr>
+                <w:b/>
+              </w:rPr>
+              <w:t>v1.2.0 - Build final</w:t>
+            </w:r>
+          </w:p>
+        </w:tc>
+        <w:tc>
+          <w:tcPr>
+            <w:tcW w:type="dxa" w:w="3106"/>
+          </w:tcPr>
+          <w:p>
+            <w:r/>
+            <w:r>
+              <w:t>30/05/2026</w:t>
+            </w:r>
+          </w:p>
+        </w:tc>
+        <w:tc>
+          <w:tcPr>
+            <w:tcW w:type="dxa" w:w="3106"/>
+          </w:tcPr>
+          <w:p>
+            <w:r/>
+            <w:r>
+              <w:t xml:space="preserve">Fix do </w:t>
+            </w:r>
+            <w:r>
+              <w:rPr>
+                <w:rFonts w:ascii="Consolas" w:hAnsi="Consolas"/>
+                <w:sz w:val="20"/>
+              </w:rPr>
+              <w:t>patrol_drone</w:t>
+            </w:r>
+            <w:r>
+              <w:t xml:space="preserve"> Dia 1 (crop pixel-absoluto obsoleto cortava o drone real após PNG regenerado). Roteiro completo consolidado em docx único para entrega. Build distribuído em 5 variantes (win/mac/linux/pc/market).</w:t>
             </w:r>
           </w:p>
         </w:tc>

</xml_diff>